<commit_message>
added saving receipts in the database
Changed .vs/v17/DocumentLayout.json and DocumentLayout.backup.json to reflect new active and recently opened files in the workspace. This updates the document monikers, selected indices, and view states to match the current editing session.
</commit_message>
<xml_diff>
--- a/Basisverslag - groenteboer(2).docx
+++ b/Basisverslag - groenteboer(2).docx
@@ -1120,7 +1120,6 @@
       <w:bookmarkStart w:id="1" w:name="_Toc116463865"/>
       <w:bookmarkStart w:id="2" w:name="_Toc158031101"/>
       <w:r>
-        <w:lastRenderedPageBreak/>
         <w:t>Ontwerp</w:t>
       </w:r>
       <w:bookmarkEnd w:id="0"/>
@@ -2781,7 +2780,6 @@
       <w:bookmarkStart w:id="5" w:name="_Toc120701912"/>
       <w:bookmarkStart w:id="6" w:name="_Toc158031104"/>
       <w:r>
-        <w:lastRenderedPageBreak/>
         <w:t>Wireframes</w:t>
       </w:r>
       <w:bookmarkEnd w:id="5"/>
@@ -2809,18 +2807,18 @@
             <v:path o:extrusionok="f" gradientshapeok="t" o:connecttype="rect"/>
             <o:lock v:ext="edit" aspectratio="t"/>
           </v:shapetype>
-          <v:shape id="_x0000_i1029" type="#_x0000_t75" style="width:76pt;height:49.25pt" o:ole="">
+          <v:shape id="_x0000_i1025" type="#_x0000_t75" style="width:76pt;height:49.25pt" o:ole="">
             <v:imagedata r:id="rId11" o:title=""/>
           </v:shape>
-          <o:OLEObject Type="Embed" ProgID="Package" ShapeID="_x0000_i1029" DrawAspect="Icon" ObjectID="_1829902515" r:id="rId12"/>
+          <o:OLEObject Type="Embed" ProgID="Package" ShapeID="_x0000_i1025" DrawAspect="Icon" ObjectID="_1829988158" r:id="rId12"/>
         </w:object>
       </w:r>
       <w:r>
         <w:object w:dxaOrig="1520" w:dyaOrig="985" w14:anchorId="1E2F20D5">
-          <v:shape id="_x0000_i1030" type="#_x0000_t75" style="width:76pt;height:49.25pt" o:ole="">
+          <v:shape id="_x0000_i1026" type="#_x0000_t75" style="width:76pt;height:49.25pt" o:ole="">
             <v:imagedata r:id="rId13" o:title=""/>
           </v:shape>
-          <o:OLEObject Type="Embed" ProgID="Package" ShapeID="_x0000_i1030" DrawAspect="Icon" ObjectID="_1829902516" r:id="rId14"/>
+          <o:OLEObject Type="Embed" ProgID="Package" ShapeID="_x0000_i1026" DrawAspect="Icon" ObjectID="_1829988159" r:id="rId14"/>
         </w:object>
       </w:r>
     </w:p>
@@ -3070,7 +3068,6 @@
       </w:pPr>
       <w:bookmarkStart w:id="17" w:name="_Toc158031107"/>
       <w:r>
-        <w:lastRenderedPageBreak/>
         <w:t>Testen</w:t>
       </w:r>
       <w:bookmarkEnd w:id="15"/>
@@ -4656,7 +4653,6 @@
                 <w:sz w:val="22"/>
                 <w:szCs w:val="22"/>
               </w:rPr>
-              <w:lastRenderedPageBreak/>
               <w:t>Voor testen invullen</w:t>
             </w:r>
           </w:p>
@@ -6177,6 +6173,7 @@
   <w:style w:type="character" w:default="1" w:styleId="Standaardalinea-lettertype">
     <w:name w:val="Default Paragraph Font"/>
     <w:uiPriority w:val="1"/>
+    <w:semiHidden/>
     <w:unhideWhenUsed/>
   </w:style>
   <w:style w:type="table" w:default="1" w:styleId="Standaardtabel">

</xml_diff>